<commit_message>
Release graded-cycle calibration v2.0.0
</commit_message>
<xml_diff>
--- a/05_manuscript/Chinese_Manuscript.docx
+++ b/05_manuscript/Chinese_Manuscript.docx
@@ -204,7 +204,7 @@
           <w:color w:val="000000"/>
           <w:sz w:val="22"/>
         </w:rPr>
-        <w:t>本研究为基于两个公开数据集的二次方法学研究。项目方向与模型开发使用自行车、跑步、赛艇和皮划艇共 819 个有效分级运动测试文件。开发前预留各项目按日期排序后最新的 30% 文件，其余 70% 使用按完整测试分组的五折交叉验证比较候选映射。最终锁定分级自行车测功的归一化二次尾部转换：g(h) = [h + 5.75 max(h - 0.90, 0)^2]/1.0575，其中 h 截断至 0-1。主要结局为 84 个时间外自行车测试文件的完整测试 VO2R 平均绝对误差（MAE）。在开发数据中拟合的过原点缩放线性和仿射线性校准作为强比较模型。外部任务迁移在 18 名 ACTES 参与者中评价。根据审稿质疑补充强度分层、剔除每个单位最大目标值、10% 强度档一致性、心率时间偏移、参数替代和心率锚点扰动分析。配对 Bootstrap 以完整测试文件或参与者为重抽样单位，共 10,000 次。</w:t>
+        <w:t>本研究为基于两个公开数据集的二次方法学研究。项目方向与模型开发使用自行车、跑步、赛艇和皮划艇共 819 个有效分级运动测试文件。开发前预留各项目按日期排序后最新的 30% 文件，其余 70% 使用按完整测试分组的五折交叉验证比较候选映射。最终锁定分级自行车测功的归一化二次尾部转换：g(h) = [h + 5.75 max(h - 0.90, 0)^2]/1.0575，其中 h 截断至 0-1。主要结局为 84 个时间外自行车测试文件的完整测试 VO2R 平均绝对误差（MAE）。在开发数据中拟合的过原点缩放线性和仿射线性校准作为强比较模型。外部任务迁移在 18 名 ACTES 参与者中评价。稳健性分析包括强度分层、剔除每个单位最大目标值、10% 强度档一致性、心率时间偏移、参数替代和心率锚点扰动。配对 Bootstrap 以完整测试文件或参与者为重抽样单位，共 10,000 次。</w:t>
       </w:r>
     </w:p>
     <w:p>
@@ -1666,7 +1666,7 @@
           <w:color w:val="000000"/>
           <w:sz w:val="22"/>
         </w:rPr>
-        <w:t>本研究未招募新参与者，也未收集新的人体数据，仅分析公开去标识数据。原始数据记录了各自的伦理审批和知情同意程序[11,12]。作者未就本二次分析另行获得机构伦理豁免或不属于人体研究的书面认定。目标期刊或所在机构可能要求提供相应确认。</w:t>
+        <w:t>本研究未招募、接触或干预参与者，也未收集可识别信息，仅分析公开去标识数据。原始数据记录了各自的伦理审批和知情同意程序[11,12]。本二次分析未另行获得机构伦理审查或书面豁免认定。</w:t>
       </w:r>
     </w:p>
     <w:p>
@@ -1804,7 +1804,7 @@
           <w:color w:val="000000"/>
           <w:sz w:val="22"/>
         </w:rPr>
-        <w:t>分析代码、确定性拆分标签、锁定参数、处理后结果表、制图代码和文档构建文件可从 https://github.com/xcai66/tHRR-I-PMData 获取。ORCID：https://orcid.org/0009-0002-3662-4539。修订仓库由 Zenodo 正式归档后，应补入新版本的专属 DOI；本文不为尚未归档的文件声称 DOI。</w:t>
+        <w:t>分析代码、确定性拆分标签、锁定参数、处理后结果表、制图代码和文档构建文件可从 https://github.com/xcai66/Calibration-of-Heart-Rate-Reserve-for-Graded-Cycle-Ergometry 获取。版本化软件归档由 Zenodo 概念 DOI https://doi.org/10.5281/zenodo.21689574 持续维护。ORCID：https://orcid.org/0009-0002-3662-4539。</w:t>
       </w:r>
     </w:p>
     <w:p>
@@ -1827,7 +1827,7 @@
           <w:color w:val="000000"/>
           <w:sz w:val="22"/>
         </w:rPr>
-        <w:t>稿件准备过程中使用生成式人工智能辅助语言润色、文档组织和代码工作。研究决策、数据源与文献核实、统计解释及最终稿件均由作者负责。该声明应按目标期刊政策调整。</w:t>
+        <w:t>稿件准备过程中使用生成式人工智能辅助语言润色、文档组织和代码工作。研究决策、数据源与文献核实、统计解释及最终稿件均由作者负责。</w:t>
       </w:r>
     </w:p>
     <w:p>

</xml_diff>